<commit_message>
Modèle Word : problème et solution à remplir, sans liste de produits
Co-Authored-By: Claude Opus 5.5 (1M context) <noreply@anthropic.com>
Claude-Session: https://claude.ai/code/session_01Kt6SKRYYFRsUKvkUpNfX33
</commit_message>
<xml_diff>
--- a/cours/design-pei5-u1/telechargements/Trace_eleve_Design_PEI5_U1-2.docx
+++ b/cours/design-pei5-u1/telechargements/Trace_eleve_Design_PEI5_U1-2.docx
@@ -309,7 +309,7 @@
                 <w:bCs/>
                 <w:color w:val="FFFFFF"/>
               </w:rPr>
-              <w:t xml:space="preserve">Mon projet (cocher une case)</w:t>
+              <w:t>Mon projet</w:t>
             </w:r>
           </w:p>
         </w:tc>
@@ -339,32 +339,28 @@
               <w:spacing w:after="80"/>
             </w:pPr>
             <w:r>
-              <w:t xml:space="preserve">☐ 1. Lampe sonore (Arduino / ESP32)</w:t>
+              <w:t>Le problème que j’ai repéré (A1) :</w:t>
             </w:r>
           </w:p>
           <w:p>
             <w:pPr>
               <w:spacing w:after="80"/>
             </w:pPr>
-            <w:r>
-              <w:t xml:space="preserve">☐ 2. Détecteur de mouvement et de lumière (Arduino / ESP32)</w:t>
-            </w:r>
+            <w:r/>
           </w:p>
           <w:p>
             <w:pPr>
               <w:spacing w:after="80"/>
             </w:pPr>
             <w:r>
-              <w:t xml:space="preserve">☐ 3. Jeu de plateforme sur le tri des déchets (PyGame)</w:t>
+              <w:t>Ma solution à concevoir (fixée en A4) :</w:t>
             </w:r>
           </w:p>
           <w:p>
             <w:pPr>
               <w:spacing w:after="80"/>
             </w:pPr>
-            <w:r>
-              <w:t xml:space="preserve">☐ 4. QCM de sensibilisation (Python : liste, SQLite ou Supabase, Flask)</w:t>
-            </w:r>
+            <w:r/>
           </w:p>
           <w:p>
             <w:pPr>
@@ -376,16 +372,14 @@
                 <w:iCs/>
                 <w:color w:val="6B6B6B"/>
               </w:rPr>
-              <w:t xml:space="preserve">Mon public cible :</w:t>
+              <w:t>Mon public cible :</w:t>
             </w:r>
           </w:p>
           <w:p>
             <w:pPr>
               <w:spacing w:after="160"/>
             </w:pPr>
-            <w:r>
-              <w:t xml:space="preserve"/>
-            </w:r>
+            <w:r/>
           </w:p>
         </w:tc>
       </w:tr>
@@ -16632,7 +16626,7 @@
           <w:i/>
           <w:iCs/>
         </w:rPr>
-        <w:t xml:space="preserve">Je refais seul(e) quatre tâches sur une nouvelle situation, sans phrases de départ ni coup de pouce. C’est l’entraînement direct pour la sommative.</w:t>
+        <w:t>Je refais seul(e) quatre tâches sur une nouvelle situation, sans phrases de départ ni coup de pouce, pour vérifier que je sais les mener sans aide.</w:t>
       </w:r>
     </w:p>
     <w:tbl>

</xml_diff>